<commit_message>
audio: embed clinical therapeutic effects, psychosomatic targets, and nested loop anchors in master DOCX compilation
</commit_message>
<xml_diff>
--- a/baza/медитации_и_аудио/ПОЛНЫЙ_СВОД_ВСЕХ_МЕДИТАЦИЙ_4_СЦЕНАРИЕВ_МАГИГ.docx
+++ b/baza/медитации_и_аудио/ПОЛНЫЙ_СВОД_ВСЕХ_МЕДИТАЦИЙ_4_СЦЕНАРИЕВ_МАГИГ.docx
@@ -29,7 +29,7 @@
           <w:color w:val="555555"/>
           <w:sz w:val="22"/>
         </w:rPr>
-        <w:t>Стандарт «Косички Эриксона» (Nested Loops) и точный дыхательный ритм (2–8 сек)</w:t>
+        <w:t>С подробными терапевтическими эффектами, психофизиологическими мишенями и паузами</w:t>
         <w:br/>
         <w:t>Спикер: Федоров Анатолий Игоревич (Семейный психолог, гипнолог, проректор МАГиГ)</w:t>
       </w:r>
@@ -50,7 +50,7 @@
     </w:p>
     <w:p>
       <w:pPr>
-        <w:spacing w:before="240" w:after="40"/>
+        <w:spacing w:before="280" w:after="40"/>
       </w:pPr>
       <w:r>
         <w:rPr>
@@ -74,7 +74,7 @@
           <w:color w:val="C0392B"/>
           <w:sz w:val="20"/>
         </w:rPr>
-        <w:t>ПАРАМЕТРЫ ЗАПИСИ</w:t>
+        <w:t>🧠 ТЕРАПЕВТИЧЕСКИЙ ЭФФЕКТ И ПСИХОЛОГИЧЕСКИЕ МИШЕНИ</w:t>
         <w:br/>
       </w:r>
       <w:r>
@@ -82,9 +82,15 @@
           <w:rFonts w:ascii="Calibri" w:hAnsi="Calibri"/>
           <w:sz w:val="19"/>
         </w:rPr>
-        <w:t>• Хронометраж: 8:30 мин | Музыка: 432 Hz, Ре минор (FlowMusic)</w:t>
+        <w:t>• Главная мишень: Снятие дофаминово-адреналиновой зависимости от «эмоциональных качелей» (чередование горячо/холодно).</w:t>
         <w:br/>
-        <w:t>• Метафоры: Маятник старинных часов ➔ Корни в граните ➔ Якорь штиля на глубине</w:t>
+        <w:t>• Соматический фокус: Расслабление диафрагмального блока («бабочки в животе»), снятие мышечного панциря в плечах и груди.</w:t>
+        <w:br/>
+        <w:t>• Терапевтический результат: Разрыв связки «тревога = страсть». Возврат энергии из фантазий о недоступном человеке в тело. Способность выбирать спокойных, надежных партнеров без чувства «скуки».</w:t>
+        <w:br/>
+        <w:t>• Параметры начитки: Хронометраж 8:30 мин | Музыка 432 Hz, Ре минор (FlowMusic)</w:t>
+        <w:br/>
+        <w:t>• Косичка метафор: Маятник старинных часов ➔ Корни в граните ➔ Якорь штиля на глубине</w:t>
       </w:r>
     </w:p>
     <w:p>
@@ -136,7 +142,7 @@
     </w:p>
     <w:p>
       <w:pPr>
-        <w:spacing w:before="240" w:after="40"/>
+        <w:spacing w:before="280" w:after="40"/>
       </w:pPr>
       <w:r>
         <w:rPr>
@@ -160,7 +166,7 @@
           <w:color w:val="C0392B"/>
           <w:sz w:val="20"/>
         </w:rPr>
-        <w:t>ПАРАМЕТРЫ ЗАПИСИ</w:t>
+        <w:t>🧠 ТЕРАПЕВТИЧЕСКИЙ ЭФФЕКТ И ПСИХОЛОГИЧЕСКИЕ МИШЕНИ</w:t>
         <w:br/>
       </w:r>
       <w:r>
@@ -168,9 +174,15 @@
           <w:rFonts w:ascii="Calibri" w:hAnsi="Calibri"/>
           <w:sz w:val="19"/>
         </w:rPr>
-        <w:t>• Хронометраж: 11:00 мин | Музыка: 963 Hz, Соль мажор (FlowMusic)</w:t>
+        <w:t>• Главная мишень: Ликвидация синдрома «спасательства» и идеализации чужого потенциала («я его отогрею/исправлю»).</w:t>
         <w:br/>
-        <w:t>• Метафоры: Собственное поместье/крепость ➔ Золотой стержень достоинства ➔ Врата с осознанным фильтром</w:t>
+        <w:t>• Соматический фокус: Выравнивание центральной оси позвоночника, ощущение опоры в тазу и стопах, расширение грудной клетки.</w:t>
+        <w:br/>
+        <w:t>• Терапевтический результат: Формирование четких внутренних критериев (зеленые и красные флаги). Выход из позиции «просителя» в позицию взрослого человека с суверенной территорией.</w:t>
+        <w:br/>
+        <w:t>• Параметры начитки: Хронометраж 11:00 мин | Музыка 963 Hz, Соль мажор (FlowMusic)</w:t>
+        <w:br/>
+        <w:t>• Косичка метафор: Собственное поместье/крепость ➔ Золотой стержень достоинства ➔ Врата с осознанным фильтром</w:t>
       </w:r>
     </w:p>
     <w:p>
@@ -212,7 +224,7 @@
     </w:p>
     <w:p>
       <w:pPr>
-        <w:spacing w:before="240" w:after="40"/>
+        <w:spacing w:before="280" w:after="40"/>
       </w:pPr>
       <w:r>
         <w:rPr>
@@ -236,7 +248,7 @@
           <w:color w:val="C0392B"/>
           <w:sz w:val="20"/>
         </w:rPr>
-        <w:t>ПАРАМЕТРЫ ЗАПИСИ</w:t>
+        <w:t>🧠 ТЕРАПЕВТИЧЕСКИЙ ЭФФЕКТ И ПСИХОЛОГИЧЕСКИЕ МИШЕНИ</w:t>
         <w:br/>
       </w:r>
       <w:r>
@@ -244,9 +256,15 @@
           <w:rFonts w:ascii="Calibri" w:hAnsi="Calibri"/>
           <w:sz w:val="19"/>
         </w:rPr>
-        <w:t>• Хронометраж: 6:00 мин | Музыка: 528 Hz, До мажор (FlowMusic)</w:t>
+        <w:t>• Главная мишень: Снятие тревоги оценки («понравлюсь ли я?», синдром самозванца перед свиданием).</w:t>
         <w:br/>
-        <w:t>• Метафоры: Теплая броня расслабления ➔ Снятие проекций ➔ Свободный разговор на равных</w:t>
+        <w:t>• Соматический фокус: Расслабление мимических мышц лица, гортани и глубокое брюшное дыхание.</w:t>
+        <w:br/>
+        <w:t>• Терапевтический результат: Переключение из тревожного гиперконтроля в состояние живого любопытства. Общение на равных, без масок и заискивания.</w:t>
+        <w:br/>
+        <w:t>• Параметры начитки: Хронометраж 6:00 мин | Музыка 528 Hz, До мажор (FlowMusic)</w:t>
+        <w:br/>
+        <w:t>• Косичка метафор: Теплая броня расслабления ➔ Снятие проекций ➔ Свободный разговор на равных</w:t>
       </w:r>
     </w:p>
     <w:p>
@@ -296,7 +314,7 @@
     </w:p>
     <w:p>
       <w:pPr>
-        <w:spacing w:before="240" w:after="40"/>
+        <w:spacing w:before="280" w:after="40"/>
       </w:pPr>
       <w:r>
         <w:rPr>
@@ -320,7 +338,7 @@
           <w:color w:val="C0392B"/>
           <w:sz w:val="20"/>
         </w:rPr>
-        <w:t>ПАРАМЕТРЫ ЗАПИСИ</w:t>
+        <w:t>🧠 ТЕРАПЕВТИЧЕСКИЙ ЭФФЕКТ И ПСИХОЛОГИЧЕСКИЕ МИШЕНИ</w:t>
         <w:br/>
       </w:r>
       <w:r>
@@ -328,9 +346,15 @@
           <w:rFonts w:ascii="Calibri" w:hAnsi="Calibri"/>
           <w:sz w:val="19"/>
         </w:rPr>
-        <w:t>• Хронометраж: 8:45 мин | Музыка: 432 Hz, Ре минор (FlowMusic)</w:t>
+        <w:t>• Главная мишень: Купирование мысленной жвачки (руминаций) и тревоги ожидания сообщений/реакций партнера.</w:t>
         <w:br/>
-        <w:t>• Метафоры: Лесной дом и камин ➔ Корни в граните ➔ Глубина океана 50 метров и Маяк</w:t>
+        <w:t>• Соматический фокус: Включение парасимпатической нервной системы через дыхание 3-2-6, заземление стоп в гранит, сброс спазма с шеи и трапеций.</w:t>
+        <w:br/>
+        <w:t>• Терапевтический результат: Остановка внутреннего диалога и катастрофизации («что он подумал?», «почему молчит?»). Возврат контроля над своим телом и эмоциональным фоном.</w:t>
+        <w:br/>
+        <w:t>• Параметры начитки: Хронометраж 8:45 мин | Музыка 432 Hz, Ре минор (FlowMusic)</w:t>
+        <w:br/>
+        <w:t>• Косичка метафор: Лесной дом и камин ➔ Корни в граните ➔ Глубина океана 50м и Маяк</w:t>
       </w:r>
     </w:p>
     <w:p>
@@ -380,7 +404,7 @@
     </w:p>
     <w:p>
       <w:pPr>
-        <w:spacing w:before="240" w:after="40"/>
+        <w:spacing w:before="280" w:after="40"/>
       </w:pPr>
       <w:r>
         <w:rPr>
@@ -404,7 +428,7 @@
           <w:color w:val="C0392B"/>
           <w:sz w:val="20"/>
         </w:rPr>
-        <w:t>ПАРАМЕТРЫ ЗАПИСИ</w:t>
+        <w:t>🧠 ТЕРАПЕВТИЧЕСКИЙ ЭФФЕКТ И ПСИХОЛОГИЧЕСКИЕ МИШЕНИ</w:t>
         <w:br/>
       </w:r>
       <w:r>
@@ -412,9 +436,15 @@
           <w:rFonts w:ascii="Calibri" w:hAnsi="Calibri"/>
           <w:sz w:val="19"/>
         </w:rPr>
-        <w:t>• Хронометраж: 10:30 мин | Музыка: 528 Hz, До мажор (FlowMusic)</w:t>
+        <w:t>• Главная мишень: Защита от манипуляций, перекладывания вины, пассивной агрессии и чужого раздражения.</w:t>
         <w:br/>
-        <w:t>• Метафоры: Священный круг ➔ Прозрачный купол (слова как опадающие листья) ➔ Зеркальный щит возврата</w:t>
+        <w:t>• Соматический фокус: Снятие кома в горле, ощущение плотной непроницаемой границы вокруг тела на расстоянии вытянутой руки.</w:t>
+        <w:br/>
+        <w:t>• Терапевтический результат: Психологическая сепарация от чужих негативных состояний. Способность спокойно выдерживать чужое недовольство без самобичевания и оправданий.</w:t>
+        <w:br/>
+        <w:t>• Параметры начитки: Хронометраж 10:30 мин | Музыка 528 Hz, До мажор (FlowMusic)</w:t>
+        <w:br/>
+        <w:t>• Косичка метафор: Священный круг ➔ Прозрачный купол (слова как листья) ➔ Зеркальный щит возврата</w:t>
       </w:r>
     </w:p>
     <w:p>
@@ -465,7 +495,7 @@
     </w:p>
     <w:p>
       <w:pPr>
-        <w:spacing w:before="240" w:after="40"/>
+        <w:spacing w:before="280" w:after="40"/>
       </w:pPr>
       <w:r>
         <w:rPr>
@@ -489,7 +519,7 @@
           <w:color w:val="C0392B"/>
           <w:sz w:val="20"/>
         </w:rPr>
-        <w:t>ПАРАМЕТРЫ ЗАПИСИ</w:t>
+        <w:t>🧠 ТЕРАПЕВТИЧЕСКИЙ ЭФФЕКТ И ПСИХОЛОГИЧЕСКИЕ МИШЕНИ</w:t>
         <w:br/>
       </w:r>
       <w:r>
@@ -497,9 +527,15 @@
           <w:rFonts w:ascii="Calibri" w:hAnsi="Calibri"/>
           <w:sz w:val="19"/>
         </w:rPr>
-        <w:t>• Хронометраж: 8:00 мин | Музыка: 528 Hz, До мажор (FlowMusic)</w:t>
+        <w:t>• Главная мишень: Снятие накопленного бытового отчуждения, фонового сарказма и защитной глухоты в браке.</w:t>
         <w:br/>
-        <w:t>• Метафоры: Горячий источник в горах ➔ Таяние ледяной корки обид ➔ Теплое дыхание сердца</w:t>
+        <w:t>• Соматический фокус: Прогревание грудной клетки и области сердца, расслабление окологлазных мышц и челюстных зажимов.</w:t>
+        <w:br/>
+        <w:t>• Терапевтический результат: Выход из циклической войны «нападающий — убегающий». Способность увидеть за бытовой претензией партнера крик о нехватке тепла и близости.</w:t>
+        <w:br/>
+        <w:t>• Параметры начитки: Хронометраж 8:00 мин | Музыка 528 Hz, До мажор (FlowMusic)</w:t>
+        <w:br/>
+        <w:t>• Косичка метафор: Горячий минеральный источник ➔ Таяние ледяной корки обид ➔ Теплое дыхание сердца</w:t>
       </w:r>
     </w:p>
     <w:p>
@@ -538,7 +574,7 @@
     </w:p>
     <w:p>
       <w:pPr>
-        <w:spacing w:before="240" w:after="40"/>
+        <w:spacing w:before="280" w:after="40"/>
       </w:pPr>
       <w:r>
         <w:rPr>
@@ -562,7 +598,7 @@
           <w:color w:val="C0392B"/>
           <w:sz w:val="20"/>
         </w:rPr>
-        <w:t>ПАРАМЕТРЫ ЗАПИСИ</w:t>
+        <w:t>🧠 ТЕРАПЕВТИЧЕСКИЙ ЭФФЕКТ И ПСИХОЛОГИЧЕСКИЕ МИШЕНИ</w:t>
         <w:br/>
       </w:r>
       <w:r>
@@ -570,9 +606,15 @@
           <w:rFonts w:ascii="Calibri" w:hAnsi="Calibri"/>
           <w:sz w:val="19"/>
         </w:rPr>
-        <w:t>• Хронометраж: 10:00 мин | Музыка: 432 Hz, Ре минор (FlowMusic)</w:t>
+        <w:t>• Главная мишень: Освобождение от груза многолетних припоминаний («а вот ты 3 года назад...») и скрытой мести.</w:t>
         <w:br/>
-        <w:t>• Метафоры: Старая долговая книга ➔ Сжигание счетов в костре ➔ Чистый лист союза</w:t>
+        <w:t>• Соматический фокус: Глубокое диафрагмальное расслабление, сброс тяжести с грудины и солнечного сплетения.</w:t>
+        <w:br/>
+        <w:t>• Терапевтический результат: Полное эмоциональное обнуление прошлых проступков, закрытие взаимных долговых книг. Переход от режима выживания к партнерской команде.</w:t>
+        <w:br/>
+        <w:t>• Параметры начитки: Хронометраж 10:00 мин | Музыка 432 Hz, Ре минор (FlowMusic)</w:t>
+        <w:br/>
+        <w:t>• Косичка метафор: Старая долговая книга ➔ Сжигание счетов в костре ➔ Чистый лист союза</w:t>
       </w:r>
     </w:p>
     <w:p>
@@ -625,7 +667,7 @@
     </w:p>
     <w:p>
       <w:pPr>
-        <w:spacing w:before="240" w:after="40"/>
+        <w:spacing w:before="280" w:after="40"/>
       </w:pPr>
       <w:r>
         <w:rPr>
@@ -649,7 +691,7 @@
           <w:color w:val="C0392B"/>
           <w:sz w:val="20"/>
         </w:rPr>
-        <w:t>ПАРАМЕТРЫ ЗАПИСИ</w:t>
+        <w:t>🧠 ТЕРАПЕВТИЧЕСКИЙ ЭФФЕКТ И ПСИХОЛОГИЧЕСКИЕ МИШЕНИ</w:t>
         <w:br/>
       </w:r>
       <w:r>
@@ -657,9 +699,15 @@
           <w:rFonts w:ascii="Calibri" w:hAnsi="Calibri"/>
           <w:sz w:val="19"/>
         </w:rPr>
-        <w:t>• Хронометраж: 6:30 мин | Музыка: 432 Hz, Ре минор (FlowMusic)</w:t>
+        <w:t>• Главная мишень: Остановка острой травматической паники, ступора или двигательного возбуждения при внезапном кризисе (измена, ультиматум, уход).</w:t>
         <w:br/>
-        <w:t>• Метафоры: Штормовая скала ➔ Защитный бункер ➔ Возврат пульса и дыхания</w:t>
+        <w:t>• Соматический фокус: Физический контакт ладоней с телом, восстановление ритмичного дыхания (3-2-6), заземление вестибулярного аппарата.</w:t>
+        <w:br/>
+        <w:t>• Терапевтический результат: Заморозка импульсивных саморазрушительных действий (умолять, мстить, устраивать истерики). Введение 14-дневного моратория на решения.</w:t>
+        <w:br/>
+        <w:t>• Параметры начитки: Хронометраж 6:30 мин | Музыка 432 Hz, Ре минор (FlowMusic)</w:t>
+        <w:br/>
+        <w:t>• Косичка метафор: Штормовая скала ➔ Защитный бункер ➔ Возврат пульса и дыхания</w:t>
       </w:r>
     </w:p>
     <w:p>
@@ -697,7 +745,7 @@
     </w:p>
     <w:p>
       <w:pPr>
-        <w:spacing w:before="240" w:after="40"/>
+        <w:spacing w:before="280" w:after="40"/>
       </w:pPr>
       <w:r>
         <w:rPr>
@@ -721,7 +769,7 @@
           <w:color w:val="C0392B"/>
           <w:sz w:val="20"/>
         </w:rPr>
-        <w:t>ПАРАМЕТРЫ ЗАПИСИ</w:t>
+        <w:t>🧠 ТЕРАПЕВТИЧЕСКИЙ ЭФФЕКТ И ПСИХОЛОГИЧЕСКИЕ МИШЕНИ</w:t>
         <w:br/>
       </w:r>
       <w:r>
@@ -729,9 +777,15 @@
           <w:rFonts w:ascii="Calibri" w:hAnsi="Calibri"/>
           <w:sz w:val="19"/>
         </w:rPr>
-        <w:t>• Хронометраж: 12:45 мин | Музыка: 963 Hz, Соль мажор (FlowMusic)</w:t>
+        <w:t>• Главная мишень: Преодоление экзистенциального краха самооценки после предательства/разрыва («я не нужен», «жизнь кончена»).</w:t>
         <w:br/>
-        <w:t>• Метафоры: Переправа на свой берег ➔ Золотой стержень оси ➔ Трон зрелости и выбор себя</w:t>
+        <w:t>• Соматический фокус: Активация центральной энергетической вертикали (золотой стержень), снятие соматического сжатия в сердце и шее.</w:t>
+        <w:br/>
+        <w:t>• Терапевтический результат: Глубокое осознание собственной автономной ценности. Способность сделать зрелый выбор — восстанавливать союз на новых условиях или достойно его завершить.</w:t>
+        <w:br/>
+        <w:t>• Параметры начитки: Хронометраж 12:45 мин | Музыка 963 Hz, Соль мажор (FlowMusic)</w:t>
+        <w:br/>
+        <w:t>• Косичка метафор: Переправа на свой берег ➔ Золотой стержень оси ➔ Трон зрелости и выбор себя</w:t>
       </w:r>
     </w:p>
     <w:p>

</xml_diff>

<commit_message>
audio: add 3rd meditation for Scenario 2 (Silent Partner Anxiety Relief) bringing master DOCX to 9 full meditations with clinical targets
</commit_message>
<xml_diff>
--- a/baza/медитации_и_аудио/ПОЛНЫЙ_СВОД_ВСЕХ_МЕДИТАЦИЙ_4_СЦЕНАРИЕВ_МАГИГ.docx
+++ b/baza/медитации_и_аудио/ПОЛНЫЙ_СВОД_ВСЕХ_МЕДИТАЦИЙ_4_СЦЕНАРИЕВ_МАГИГ.docx
@@ -14,7 +14,7 @@
           <w:color w:val="1F4E5B"/>
           <w:sz w:val="36"/>
         </w:rPr>
-        <w:t>ПОЛНЫЙ СВОД ВСЕХ АУДИОМЕДИТАЦИЙ ПО 4-М СЦЕНАРИЯМ</w:t>
+        <w:t>ПОЛНЫЙ СВОД ВСЕХ 9-ТИ АУДИОМЕДИТАЦИЙ ПО 4-М СЦЕНАРИЯМ</w:t>
       </w:r>
     </w:p>
     <w:p>
@@ -29,7 +29,7 @@
           <w:color w:val="555555"/>
           <w:sz w:val="22"/>
         </w:rPr>
-        <w:t>С подробными терапевтическими эффектами, психофизиологическими мишенями и паузами</w:t>
+        <w:t>С клиническими терапевтическими эффектами, соматическими мишенями и точными паузами</w:t>
         <w:br/>
         <w:t>Спикер: Федоров Анатолий Игоревич (Семейный психолог, гипнолог, проректор МАГиГ)</w:t>
       </w:r>
@@ -481,6 +481,107 @@
     </w:p>
     <w:p>
       <w:pPr>
+        <w:spacing w:before="280" w:after="40"/>
+      </w:pPr>
+      <w:r>
+        <w:rPr>
+          <w:rFonts w:ascii="Calibri" w:hAnsi="Calibri"/>
+          <w:b/>
+          <w:color w:val="0E6E5D"/>
+          <w:sz w:val="24"/>
+        </w:rPr>
+        <w:t>🎧 2.3. АУДИОПРАКТИКА: «СНЯТИЕ ТРЕВОГИ ПРИ МОЛЧАНИИ ИЛИ ОТСТРАНЕНИИ ПАРТНЁРА» (Бонус 3, emotions)</w:t>
+      </w:r>
+    </w:p>
+    <w:p>
+      <w:pPr>
+        <w:spacing w:before="80" w:after="160"/>
+        <w:ind w:left="288"/>
+      </w:pPr>
+      <w:r>
+        <w:rPr>
+          <w:rFonts w:ascii="Calibri" w:hAnsi="Calibri"/>
+          <w:b/>
+          <w:color w:val="C0392B"/>
+          <w:sz w:val="20"/>
+        </w:rPr>
+        <w:t>🧠 ТЕРАПЕВТИЧЕСКИЙ ЭФФЕКТ И ПСИХОЛОГИЧЕСКИЕ МИШЕНИ</w:t>
+        <w:br/>
+      </w:r>
+      <w:r>
+        <w:rPr>
+          <w:rFonts w:ascii="Calibri" w:hAnsi="Calibri"/>
+          <w:sz w:val="19"/>
+        </w:rPr>
+        <w:t>• Главная мишень: Экстренная остановка компульсивного желания написать/позвонить при паузе в 3+ часа или закрытости партнера.</w:t>
+        <w:br/>
+        <w:t>• Соматический фокус: Снятие спазма с солнечного сплетения и ладоней, возвращение теплого глубокого дыхания в живот.</w:t>
+        <w:br/>
+        <w:t>• Терапевтический результат: Разделение «его молчание — это его личный процесс, а не мой приговор». Возврат пульта от своего настроения в собственные руки. Спокойное выдерживание дистанции.</w:t>
+        <w:br/>
+        <w:t>• Параметры начитки: Хронометраж 7:00 мин | Музыка 528 Hz, До мажор (FlowMusic)</w:t>
+        <w:br/>
+        <w:t>• Косичка метафор: Тихая бухта в тумане ➔ Возврат пульта управления ➔ Разделение процессов на глубине</w:t>
+      </w:r>
+    </w:p>
+    <w:p>
+      <w:pPr>
+        <w:spacing w:after="120" w:line="300" w:lineRule="auto"/>
+      </w:pPr>
+      <w:r>
+        <w:rPr>
+          <w:rFonts w:ascii="Calibri" w:hAnsi="Calibri"/>
+          <w:sz w:val="21"/>
+        </w:rPr>
+        <w:t>[Музыкальное вступление — Пауза 6 сек]</w:t>
+        <w:br/>
+        <w:br/>
+        <w:t>Положи правую ладонь себе на солнечное сплетение, а левую — на грудь… [Пауза 4 сек]</w:t>
+        <w:br/>
+        <w:t>Сделай медленный вдох… и очень длинный, мягкий выдох… [Пауза 5 сек]</w:t>
+        <w:br/>
+        <w:br/>
+        <w:t>Когда телефон молчит, или близкий человек закрылся и ушел в себя — внутри мгновенно вспыхивает древняя детская паника… [Пауза 4 сек]</w:t>
+        <w:br/>
+        <w:t>Кажется, что пауза — это отвержение… [Пауза 3 сек]</w:t>
+        <w:br/>
+        <w:t>Рука сама тянется написать, проверить, выяснить, догнать… [Пауза 4 сек]</w:t>
+        <w:br/>
+        <w:br/>
+        <w:t>Остановись. Прямо сейчас ничего не делай. [Пауза 4 сек]</w:t>
+        <w:br/>
+        <w:t>Представь, что ты стоишь на берегу тихой морской бухты, которую окутал густой вечерний туман… [Пауза 4 сек]</w:t>
+        <w:br/>
+        <w:t>В тумане не видно противоположного берега. Но это не значит, что берег исчез. [Пауза 5 сек]</w:t>
+        <w:br/>
+        <w:br/>
+        <w:t>Ты долго держал в руках невидимый пульт, пытаясь силой мысли переключить чужое настроение, ускорить чужой ответ или заставить его открыться… [Пауза 5 сек]</w:t>
+        <w:br/>
+        <w:t>Положи этот чужой пульт на песок. [Пауза 3 сек]</w:t>
+        <w:br/>
+        <w:t>Ты не можешь управлять чужой погодой. Но ты полностью управляешь своим теплом. [Пауза 5 сек]</w:t>
+        <w:br/>
+        <w:br/>
+        <w:t>Почувствуй, как тепло твоих ладоней согревает грудь и живот… [Пауза 4 сек]</w:t>
+        <w:br/>
+        <w:t>Скажи себе спокойно и уверенно: [Пауза 3 сек]</w:t>
+        <w:br/>
+        <w:t>«Его молчание — это его процесс. Это не значит, что меня стало меньше… [Пауза 4 сек]</w:t>
+        <w:br/>
+        <w:t>Я не в опасности. Я взрослый. Я у себя есть. Моя жизнь продолжается прямо сейчас»… [Пауза 6 сек]</w:t>
+        <w:br/>
+        <w:br/>
+        <w:t>Туман над бухтой начинает мягко таять под первыми лучами солнца… [Пауза 4 сек]</w:t>
+        <w:br/>
+        <w:t>Дыхание стало ровным, глубоким и просторным… [Пауза 4 сек]</w:t>
+        <w:br/>
+        <w:t>Ты свободен от ожидания. Ты возвращаешься к своим делам и своему дню. [Пауза 4 сек]</w:t>
+        <w:br/>
+        <w:t>Сделай глубокий вдох… выдохни с улыбкой… и открой глаза. [Музыкальное завершение — Пауза 6 сек]</w:t>
+      </w:r>
+    </w:p>
+    <w:p>
+      <w:pPr>
         <w:spacing w:before="360" w:after="80"/>
       </w:pPr>
       <w:r>

</xml_diff>

<commit_message>
audio: finalize master compilation containing 100% full text of all 10 meditations with clinical passports and pauses across all 4 scenarios
</commit_message>
<xml_diff>
--- a/baza/медитации_и_аудио/ПОЛНЫЙ_СВОД_ВСЕХ_МЕДИТАЦИЙ_4_СЦЕНАРИЕВ_МАГИГ.docx
+++ b/baza/медитации_и_аудио/ПОЛНЫЙ_СВОД_ВСЕХ_МЕДИТАЦИЙ_4_СЦЕНАРИЕВ_МАГИГ.docx
@@ -14,7 +14,7 @@
           <w:color w:val="1F4E5B"/>
           <w:sz w:val="36"/>
         </w:rPr>
-        <w:t>ПОЛНЫЙ СВОД ВСЕХ 9-ТИ АУДИОМЕДИТАЦИЙ ПО 4-М СЦЕНАРИЯМ</w:t>
+        <w:t>ПОЛНЫЙ СВОД ВСЕХ 10 АУДИОМЕДИТАЦИЙ ПО 4-М СЦЕНАРИЯМ</w:t>
       </w:r>
     </w:p>
     <w:p>
@@ -29,7 +29,7 @@
           <w:color w:val="555555"/>
           <w:sz w:val="22"/>
         </w:rPr>
-        <w:t>С клиническими терапевтическими эффектами, соматическими мишенями и точными паузами</w:t>
+        <w:t>Генеральный студийный документ: терапевтический паспорт, метод «Косички Эриксона», посекундные паузы</w:t>
         <w:br/>
         <w:t>Спикер: Федоров Анатолий Игоревич (Семейный психолог, гипнолог, проректор МАГиГ)</w:t>
       </w:r>
@@ -74,7 +74,7 @@
           <w:color w:val="C0392B"/>
           <w:sz w:val="20"/>
         </w:rPr>
-        <w:t>🧠 ТЕРАПЕВТИЧЕСКИЙ ЭФФЕКТ И ПСИХОЛОГИЧЕСКИЕ МИШЕНИ</w:t>
+        <w:t>🧠 ТЕРАПЕВТИЧЕСКИЙ ПАСПОРТ</w:t>
         <w:br/>
       </w:r>
       <w:r>
@@ -82,15 +82,15 @@
           <w:rFonts w:ascii="Calibri" w:hAnsi="Calibri"/>
           <w:sz w:val="19"/>
         </w:rPr>
-        <w:t>• Главная мишень: Снятие дофаминово-адреналиновой зависимости от «эмоциональных качелей» (чередование горячо/холодно).</w:t>
+        <w:t>• Психологическая мишень: Снятие адреналиновой зависимости от эмоциональных качелей и идеализации недоступных партнеров.</w:t>
         <w:br/>
-        <w:t>• Соматический фокус: Расслабление диафрагмального блока («бабочки в животе»), снятие мышечного панциря в плечах и груди.</w:t>
+        <w:t>• Соматический фокус: Расслабление диафрагмального блока, снятие спазма в плечах и груди, заземление стоп.</w:t>
         <w:br/>
-        <w:t>• Терапевтический результат: Разрыв связки «тревога = страсть». Возврат энергии из фантазий о недоступном человеке в тело. Способность выбирать спокойных, надежных партнеров без чувства «скуки».</w:t>
+        <w:t>• Терапевтический результат: Разрыв связки «тревога = страсть». Способность выбирать спокойных, надежных партнеров без чувства «скуки».</w:t>
         <w:br/>
-        <w:t>• Параметры начитки: Хронометраж 8:30 мин | Музыка 432 Hz, Ре минор (FlowMusic)</w:t>
+        <w:t>• Параметры начитки: 8:30 мин | Музыка FlowMusic 432 Hz, Ре минор | Дыхание 3-2-6</w:t>
         <w:br/>
-        <w:t>• Косичка метафор: Маятник старинных часов ➔ Корни в граните ➔ Якорь штиля на глубине</w:t>
+        <w:t>• Архитектура Косички: А1 (Мастерская старинных часов) ➔ Б1 (Корни в граните) ➔ В (Ядро: Океанский штиль) ➔ Б2 (Подъем силы) ➔ А2 (Недвижный центр)</w:t>
       </w:r>
     </w:p>
     <w:p>
@@ -166,7 +166,7 @@
           <w:color w:val="C0392B"/>
           <w:sz w:val="20"/>
         </w:rPr>
-        <w:t>🧠 ТЕРАПЕВТИЧЕСКИЙ ЭФФЕКТ И ПСИХОЛОГИЧЕСКИЕ МИШЕНИ</w:t>
+        <w:t>🧠 ТЕРАПЕВТИЧЕСКИЙ ПАСПОРТ</w:t>
         <w:br/>
       </w:r>
       <w:r>
@@ -174,15 +174,15 @@
           <w:rFonts w:ascii="Calibri" w:hAnsi="Calibri"/>
           <w:sz w:val="19"/>
         </w:rPr>
-        <w:t>• Главная мишень: Ликвидация синдрома «спасательства» и идеализации чужого потенциала («я его отогрею/исправлю»).</w:t>
+        <w:t>• Психологическая мишень: Ликвидация спасательства, выхода из детской позиции «выпрашивания любви».</w:t>
         <w:br/>
-        <w:t>• Соматический фокус: Выравнивание центральной оси позвоночника, ощущение опоры в тазу и стопах, расширение грудной клетки.</w:t>
+        <w:t>• Соматический фокус: Выравнивание оси позвоночника, тепло в ладонях, глубинная опора в тазу.</w:t>
         <w:br/>
-        <w:t>• Терапевтический результат: Формирование четких внутренних критериев (зеленые и красные флаги). Выход из позиции «просителя» в позицию взрослого человека с суверенной территорией.</w:t>
+        <w:t>• Терапевтический результат: Формирование четких границ и ценностей. Способность спокойно закрывать контакт при первых красных флагах.</w:t>
         <w:br/>
-        <w:t>• Параметры начитки: Хронометраж 11:00 мин | Музыка 963 Hz, Соль мажор (FlowMusic)</w:t>
+        <w:t>• Параметры начитки: 11:00 мин | Музыка FlowMusic 963 Hz, Соль мажор</w:t>
         <w:br/>
-        <w:t>• Косичка метафор: Собственное поместье/крепость ➔ Золотой стержень достоинства ➔ Врата с осознанным фильтром</w:t>
+        <w:t>• Архитектура Косички: А1 (Собственное поместье) ➔ Б1 (Золотой стержень достоинства) ➔ В (Ядро: Внутренний страж у врат)</w:t>
       </w:r>
     </w:p>
     <w:p>
@@ -248,7 +248,7 @@
           <w:color w:val="C0392B"/>
           <w:sz w:val="20"/>
         </w:rPr>
-        <w:t>🧠 ТЕРАПЕВТИЧЕСКИЙ ЭФФЕКТ И ПСИХОЛОГИЧЕСКИЕ МИШЕНИ</w:t>
+        <w:t>🧠 ТЕРАПЕВТИЧЕСКИЙ ПАСПОРТ</w:t>
         <w:br/>
       </w:r>
       <w:r>
@@ -256,15 +256,13 @@
           <w:rFonts w:ascii="Calibri" w:hAnsi="Calibri"/>
           <w:sz w:val="19"/>
         </w:rPr>
-        <w:t>• Главная мишень: Снятие тревоги оценки («понравлюсь ли я?», синдром самозванца перед свиданием).</w:t>
+        <w:t>• Психологическая мишень: Снятие тревоги оценки, скованности и заискивания перед новым человеком.</w:t>
         <w:br/>
-        <w:t>• Соматический фокус: Расслабление мимических мышц лица, гортани и глубокое брюшное дыхание.</w:t>
+        <w:t>• Соматический фокус: Расслабление мимики, челюсти, глубокий брюшной вдох.</w:t>
         <w:br/>
-        <w:t>• Терапевтический результат: Переключение из тревожного гиперконтроля в состояние живого любопытства. Общение на равных, без масок и заискивания.</w:t>
+        <w:t>• Терапевтический результат: Общение из взрослой исследовательской позиции: «подходит ли мне этот человек?» вместо «понравлюсь ли я ему?».</w:t>
         <w:br/>
-        <w:t>• Параметры начитки: Хронометраж 6:00 мин | Музыка 528 Hz, До мажор (FlowMusic)</w:t>
-        <w:br/>
-        <w:t>• Косичка метафор: Теплая броня расслабления ➔ Снятие проекций ➔ Свободный разговор на равных</w:t>
+        <w:t>• Параметры начитки: 6:00 мин | Музыка FlowMusic 528 Hz, До мажор</w:t>
       </w:r>
     </w:p>
     <w:p>
@@ -338,7 +336,7 @@
           <w:color w:val="C0392B"/>
           <w:sz w:val="20"/>
         </w:rPr>
-        <w:t>🧠 ТЕРАПЕВТИЧЕСКИЙ ЭФФЕКТ И ПСИХОЛОГИЧЕСКИЕ МИШЕНИ</w:t>
+        <w:t>🧠 ТЕРАПЕВТИЧЕСКИЙ ПАСПОРТ</w:t>
         <w:br/>
       </w:r>
       <w:r>
@@ -346,15 +344,15 @@
           <w:rFonts w:ascii="Calibri" w:hAnsi="Calibri"/>
           <w:sz w:val="19"/>
         </w:rPr>
-        <w:t>• Главная мишень: Купирование мысленной жвачки (руминаций) и тревоги ожидания сообщений/реакций партнера.</w:t>
+        <w:t>• Психологическая мишень: Снятие мысленной жвачки (руминаций), паники, когда партнер не отвечает или эмоционально отдалился.</w:t>
         <w:br/>
-        <w:t>• Соматический фокус: Включение парасимпатической нервной системы через дыхание 3-2-6, заземление стоп в гранит, сброс спазма с шеи и трапеций.</w:t>
+        <w:t>• Соматический фокус: Прорастание корней от стоп в гранит, замедление пульса, расслабление трапеций и шеи.</w:t>
         <w:br/>
-        <w:t>• Терапевтический результат: Остановка внутреннего диалога и катастрофизации («что он подумал?», «почему молчит?»). Возврат контроля над своим телом и эмоциональным фоном.</w:t>
+        <w:t>• Терапевтический результат: Полный возврат внимания из чужой головы в собственное тело. Ощущение нерушимой безопасности.</w:t>
         <w:br/>
-        <w:t>• Параметры начитки: Хронометраж 8:45 мин | Музыка 432 Hz, Ре минор (FlowMusic)</w:t>
+        <w:t>• Параметры начитки: 8:45 мин | Музыка FlowMusic 432 Hz, Ре минор | Дыхание 3-2-6</w:t>
         <w:br/>
-        <w:t>• Косичка метафор: Лесной дом и камин ➔ Корни в граните ➔ Глубина океана 50м и Маяк</w:t>
+        <w:t>• Архитектура Косички: А1 (Лесной дом и камин) ➔ Б1 (Корни в граните) ➔ В (Ядро: Океан 50м и Маяк) ➔ Б2 (Сила земли) ➔ А2 (Угли и привал)</w:t>
       </w:r>
     </w:p>
     <w:p>
@@ -428,7 +426,7 @@
           <w:color w:val="C0392B"/>
           <w:sz w:val="20"/>
         </w:rPr>
-        <w:t>🧠 ТЕРАПЕВТИЧЕСКИЙ ЭФФЕКТ И ПСИХОЛОГИЧЕСКИЕ МИШЕНИ</w:t>
+        <w:t>🧠 ТЕРАПЕВТИЧЕСКИЙ ПАСПОРТ</w:t>
         <w:br/>
       </w:r>
       <w:r>
@@ -436,15 +434,15 @@
           <w:rFonts w:ascii="Calibri" w:hAnsi="Calibri"/>
           <w:sz w:val="19"/>
         </w:rPr>
-        <w:t>• Главная мишень: Защита от манипуляций, перекладывания вины, пассивной агрессии и чужого раздражения.</w:t>
+        <w:t>• Психологическая мишень: Психологическая сепарация от чужих претензий, пассивной агрессии и попыток повесить вину.</w:t>
         <w:br/>
-        <w:t>• Соматический фокус: Снятие кома в горле, ощущение плотной непроницаемой границы вокруг тела на расстоянии вытянутой руки.</w:t>
+        <w:t>• Соматический фокус: Снятие спазма в горле, формирование тактильной защитной границы вокруг тела.</w:t>
         <w:br/>
-        <w:t>• Терапевтический результат: Психологическая сепарация от чужих негативных состояний. Способность спокойно выдерживать чужое недовольство без самобичевания и оправданий.</w:t>
+        <w:t>• Терапевтический результат: Способность не вовлекаться в чужие эмоциональные срывы, сохранять достоинство и внутреннюю тишину.</w:t>
         <w:br/>
-        <w:t>• Параметры начитки: Хронометраж 10:30 мин | Музыка 528 Hz, До мажор (FlowMusic)</w:t>
+        <w:t>• Параметры начитки: 10:30 мин | Музыка FlowMusic 528 Hz, До мажор</w:t>
         <w:br/>
-        <w:t>• Косичка метафор: Священный круг ➔ Прозрачный купол (слова как листья) ➔ Зеркальный щит возврата</w:t>
+        <w:t>• Архитектура Косички: А1 (Горная поляна и круг) ➔ Б1 (Прозрачный купол и опадающие слова) ➔ В (Ядро: Зеркальный щит возврата)</w:t>
       </w:r>
     </w:p>
     <w:p>
@@ -505,7 +503,7 @@
           <w:color w:val="C0392B"/>
           <w:sz w:val="20"/>
         </w:rPr>
-        <w:t>🧠 ТЕРАПЕВТИЧЕСКИЙ ЭФФЕКТ И ПСИХОЛОГИЧЕСКИЕ МИШЕНИ</w:t>
+        <w:t>🧠 ТЕРАПЕВТИЧЕСКИЙ ПАСПОРТ</w:t>
         <w:br/>
       </w:r>
       <w:r>
@@ -513,15 +511,15 @@
           <w:rFonts w:ascii="Calibri" w:hAnsi="Calibri"/>
           <w:sz w:val="19"/>
         </w:rPr>
-        <w:t>• Главная мишень: Экстренная остановка компульсивного желания написать/позвонить при паузе в 3+ часа или закрытости партнера.</w:t>
+        <w:t>• Психологическая мишень: Экстренная остановка компульсивных порывов писать/звонить/выяснять отношения при молчании в сети.</w:t>
         <w:br/>
-        <w:t>• Соматический фокус: Снятие спазма с солнечного сплетения и ладоней, возвращение теплого глубокого дыхания в живот.</w:t>
+        <w:t>• Соматический фокус: Прогревание солнечного сплетения ладонями, снятие дрожи в руках, ровный выдох.</w:t>
         <w:br/>
-        <w:t>• Терапевтический результат: Разделение «его молчание — это его личный процесс, а не мой приговор». Возврат пульта от своего настроения в собственные руки. Спокойное выдерживание дистанции.</w:t>
+        <w:t>• Терапевтический результат: Разделение «его молчание — это его процесс, а не мой приговор». Возврат пульта от своего спокойствия.</w:t>
         <w:br/>
-        <w:t>• Параметры начитки: Хронометраж 7:00 мин | Музыка 528 Hz, До мажор (FlowMusic)</w:t>
+        <w:t>• Параметры начитки: 6:45 мин | Музыка FlowMusic 528 Hz, До мажор</w:t>
         <w:br/>
-        <w:t>• Косичка метафор: Тихая бухта в тумане ➔ Возврат пульта управления ➔ Разделение процессов на глубине</w:t>
+        <w:t>• Архитектура Косички: А1 (Тихая бухта в тумане) ➔ Б1 (Возврат пульта управления себе) ➔ В (Ядро: Отлив моря и стойкость берега)</w:t>
       </w:r>
     </w:p>
     <w:p>
@@ -533,51 +531,49 @@
           <w:rFonts w:ascii="Calibri" w:hAnsi="Calibri"/>
           <w:sz w:val="21"/>
         </w:rPr>
-        <w:t>[Музыкальное вступление — Пауза 6 сек]</w:t>
+        <w:t>[Музыкальное вступление — Пауза 4 сек]</w:t>
         <w:br/>
         <w:br/>
-        <w:t>Положи правую ладонь себе на солнечное сплетение, а левую — на грудь… [Пауза 4 сек]</w:t>
+        <w:t xml:space="preserve">Положите телефон экраном вниз.  </w:t>
         <w:br/>
-        <w:t>Сделай медленный вдох… и очень длинный, мягкий выдох… [Пауза 5 сек]</w:t>
+        <w:t>Прямо сейчас вам не нужно никому писать. Не нужно звонить. Не нужно ничего проверять или доказывать. [Пауза 4 сек]</w:t>
         <w:br/>
         <w:br/>
-        <w:t>Когда телефон молчит, или близкий человек закрылся и ушел в себя — внутри мгновенно вспыхивает древняя детская паника… [Пауза 4 сек]</w:t>
+        <w:t xml:space="preserve">Всё, что сейчас происходит во внешнем мире, может подождать несколько минут.  </w:t>
         <w:br/>
-        <w:t>Кажется, что пауза — это отвержение… [Пауза 3 сек]</w:t>
-        <w:br/>
-        <w:t>Рука сама тянется написать, проверить, выяснить, догнать… [Пауза 4 сек]</w:t>
+        <w:t>Позвольте себе закрыть глаза… и просто почувствовать, как ваши стопы касаются пола, а тело находит надёжную опору на кресле или постели. [Пауза 4 сек]</w:t>
         <w:br/>
         <w:br/>
-        <w:t>Остановись. Прямо сейчас ничего не делай. [Пауза 4 сек]</w:t>
+        <w:t>Сделайте глубокий, свободный вдох… и длинный, медленный, отпускающий выдох через слегка разомкнутые губы. [Пауза 5 сек]</w:t>
         <w:br/>
-        <w:t>Представь, что ты стоишь на берегу тихой морской бухты, которую окутал густой вечерний туман… [Пауза 4 сек]</w:t>
-        <w:br/>
-        <w:t>В тумане не видно противоположного берега. Но это не значит, что берег исчез. [Пауза 5 сек]</w:t>
+        <w:t>Я рядом. И в следующие несколько минут мы вернём вам вашу устойчивость. [Пауза 3 сек]</w:t>
         <w:br/>
         <w:br/>
-        <w:t>Ты долго держал в руках невидимый пульт, пытаясь силой мысли переключить чужое настроение, ускорить чужой ответ или заставить его открыться… [Пауза 5 сек]</w:t>
+        <w:t>Представьте себе древний, уединённый берег океана. Раннее утро. Над водой лежит густой туман — плотный, как влажный шёлк. [Пауза 4 сек]</w:t>
         <w:br/>
-        <w:t>Положи этот чужой пульт на песок. [Пауза 3 сек]</w:t>
-        <w:br/>
-        <w:t>Ты не можешь управлять чужой погодой. Но ты полностью управляешь своим теплом. [Пауза 5 сек]</w:t>
+        <w:t>В этом тумане не видно горизонта. Но прямо под вами — не зыбкий песок, а монолитная, вековая скала. [Пауза 5 сек]</w:t>
         <w:br/>
         <w:br/>
-        <w:t>Почувствуй, как тепло твоих ладоней согревает грудь и живот… [Пауза 4 сек]</w:t>
+        <w:t>Когда человек сталкивается с чужой тишиной, внутри часто вспыхивает тревожный импульс: заполнить пустоту любой ценой. Будто вы случайно отдали пульт управления своим сердцем в чужие руки. [Пауза 4 сек]</w:t>
         <w:br/>
-        <w:t>Скажи себе спокойно и уверенно: [Пауза 3 сек]</w:t>
-        <w:br/>
-        <w:t>«Его молчание — это его процесс. Это не значит, что меня стало меньше… [Пауза 4 сек]</w:t>
-        <w:br/>
-        <w:t>Я не в опасности. Я взрослый. Я у себя есть. Моя жизнь продолжается прямо сейчас»… [Пауза 6 сек]</w:t>
+        <w:t>Но прямо сейчас… сделайте вдох… и на выдохе представьте, как вы забираете этот пульт назад. [Пауза 4 сек]</w:t>
         <w:br/>
         <w:br/>
-        <w:t>Туман над бухтой начинает мягко таять под первыми лучами солнца… [Пауза 4 сек]</w:t>
+        <w:t>Вы разжимаете пальцы. Тяжёлый рюкзак тревожных догадок соскальзывает с ваших плеч на землю. [Пауза 5 сек]</w:t>
         <w:br/>
-        <w:t>Дыхание стало ровным, глубоким и просторным… [Пауза 4 сек]</w:t>
+        <w:t>Чужое молчание… чужое отстранение — это не послание вам. Это пространство другого человека. [Пауза 5 сек]</w:t>
         <w:br/>
-        <w:t>Ты свободен от ожидания. Ты возвращаешься к своим делам и своему дню. [Пауза 4 сек]</w:t>
         <w:br/>
-        <w:t>Сделай глубокий вдох… выдохни с улыбкой… и открой глаза. [Музыкальное завершение — Пауза 6 сек]</w:t>
+        <w:t>Когда море отступает во время отлива, берег не кричит ему вслед. Берег знает: отлив — это закон движения воды, а не дефект земли. [Пауза 6 сек]</w:t>
+        <w:br/>
+        <w:t>Его пауза не делает вас меньше. Ваша ценность — это солнце над облаками. [Пауза 5 сек]</w:t>
+        <w:br/>
+        <w:br/>
+        <w:t>Тепло возвращается в ладони и грудь. В вас есть спокойная сила человека, умеющего выдерживать паузу. [Пауза 4 сек]</w:t>
+        <w:br/>
+        <w:t>Мягкий ветер разгоняет туман над бухтой. Открывается чистое, сияющее море. [Пауза 4 сек]</w:t>
+        <w:br/>
+        <w:t>Сделайте глубокий вдох… выдох… и откройте глаза. Вы дома. Внутри себя. [Музыкальное завершение — Пауза 5 сек]</w:t>
       </w:r>
     </w:p>
     <w:p>
@@ -620,7 +616,7 @@
           <w:color w:val="C0392B"/>
           <w:sz w:val="20"/>
         </w:rPr>
-        <w:t>🧠 ТЕРАПЕВТИЧЕСКИЙ ЭФФЕКТ И ПСИХОЛОГИЧЕСКИЕ МИШЕНИ</w:t>
+        <w:t>🧠 ТЕРАПЕВТИЧЕСКИЙ ПАСПОРТ</w:t>
         <w:br/>
       </w:r>
       <w:r>
@@ -628,15 +624,13 @@
           <w:rFonts w:ascii="Calibri" w:hAnsi="Calibri"/>
           <w:sz w:val="19"/>
         </w:rPr>
-        <w:t>• Главная мишень: Снятие накопленного бытового отчуждения, фонового сарказма и защитной глухоты в браке.</w:t>
+        <w:t>• Психологическая мишень: Снятие бытовой раздражительности, эмоциональной глухоты и взаимных уколов в браке.</w:t>
         <w:br/>
-        <w:t>• Соматический фокус: Прогревание грудной клетки и области сердца, расслабление окологлазных мышц и челюстных зажимов.</w:t>
+        <w:t>• Соматический фокус: Прогревание области сердца, расслабление жевательных мышц и окологлазных зон.</w:t>
         <w:br/>
-        <w:t>• Терапевтический результат: Выход из циклической войны «нападающий — убегающий». Способность увидеть за бытовой претензией партнера крик о нехватке тепла и близости.</w:t>
+        <w:t>• Терапевтический результат: Разрыв цикла «нападающий — убегающий». Способность видеть в партнере союзника, а не источник угрозы.</w:t>
         <w:br/>
-        <w:t>• Параметры начитки: Хронометраж 8:00 мин | Музыка 528 Hz, До мажор (FlowMusic)</w:t>
-        <w:br/>
-        <w:t>• Косичка метафор: Горячий минеральный источник ➔ Таяние ледяной корки обид ➔ Теплое дыхание сердца</w:t>
+        <w:t>• Параметры начитки: 8:00 мин | Музыка FlowMusic 528 Hz, До мажор</w:t>
       </w:r>
     </w:p>
     <w:p>
@@ -699,7 +693,7 @@
           <w:color w:val="C0392B"/>
           <w:sz w:val="20"/>
         </w:rPr>
-        <w:t>🧠 ТЕРАПЕВТИЧЕСКИЙ ЭФФЕКТ И ПСИХОЛОГИЧЕСКИЕ МИШЕНИ</w:t>
+        <w:t>🧠 ТЕРАПЕВТИЧЕСКИЙ ПАСПОРТ</w:t>
         <w:br/>
       </w:r>
       <w:r>
@@ -707,15 +701,13 @@
           <w:rFonts w:ascii="Calibri" w:hAnsi="Calibri"/>
           <w:sz w:val="19"/>
         </w:rPr>
-        <w:t>• Главная мишень: Освобождение от груза многолетних припоминаний («а вот ты 3 года назад...») и скрытой мести.</w:t>
+        <w:t>• Психологическая мишень: Освобождение от груза прошлых обид, припоминаний и скрытой семейной вендетты.</w:t>
         <w:br/>
-        <w:t>• Соматический фокус: Глубокое диафрагмальное расслабление, сброс тяжести с грудины и солнечного сплетения.</w:t>
+        <w:t>• Соматический фокус: Освобождение грудины от чувства сдавленности, глубокое ровное дыхание.</w:t>
         <w:br/>
-        <w:t>• Терапевтический результат: Полное эмоциональное обнуление прошлых проступков, закрытие взаимных долговых книг. Переход от режима выживания к партнерской команде.</w:t>
+        <w:t>• Терапевтический результат: Эмоциональное обнуление старых долгов. Открытие пространства для нового диалога на равных.</w:t>
         <w:br/>
-        <w:t>• Параметры начитки: Хронометраж 10:00 мин | Музыка 432 Hz, Ре минор (FlowMusic)</w:t>
-        <w:br/>
-        <w:t>• Косичка метафор: Старая долговая книга ➔ Сжигание счетов в костре ➔ Чистый лист союза</w:t>
+        <w:t>• Параметры начитки: 10:00 мин | Музыка FlowMusic 432 Hz, Ре минор</w:t>
       </w:r>
     </w:p>
     <w:p>
@@ -792,7 +784,7 @@
           <w:color w:val="C0392B"/>
           <w:sz w:val="20"/>
         </w:rPr>
-        <w:t>🧠 ТЕРАПЕВТИЧЕСКИЙ ЭФФЕКТ И ПСИХОЛОГИЧЕСКИЕ МИШЕНИ</w:t>
+        <w:t>🧠 ТЕРАПЕВТИЧЕСКИЙ ПАСПОРТ</w:t>
         <w:br/>
       </w:r>
       <w:r>
@@ -800,15 +792,13 @@
           <w:rFonts w:ascii="Calibri" w:hAnsi="Calibri"/>
           <w:sz w:val="19"/>
         </w:rPr>
-        <w:t>• Главная мишень: Остановка острой травматической паники, ступора или двигательного возбуждения при внезапном кризисе (измена, ультиматум, уход).</w:t>
+        <w:t>• Психологическая мишень: Экстренная остановка травматического шока, истерики, ступора при внезапном разрыве/измене.</w:t>
         <w:br/>
-        <w:t>• Соматический фокус: Физический контакт ладоней с телом, восстановление ритмичного дыхания (3-2-6), заземление вестибулярного аппарата.</w:t>
+        <w:t>• Соматический фокус: Ладони на груди, восстановление парасимпатического дыхания (вдох 3с, выдох 6с).</w:t>
         <w:br/>
-        <w:t>• Терапевтический результат: Заморозка импульсивных саморазрушительных действий (умолять, мстить, устраивать истерики). Введение 14-дневного моратория на решения.</w:t>
+        <w:t>• Терапевтический результат: Заморозка импульсивных разрушительных действий. Мораторий 14 дней на любые резкие решения.</w:t>
         <w:br/>
-        <w:t>• Параметры начитки: Хронометраж 6:30 мин | Музыка 432 Hz, Ре минор (FlowMusic)</w:t>
-        <w:br/>
-        <w:t>• Косичка метафор: Штормовая скала ➔ Защитный бункер ➔ Возврат пульса и дыхания</w:t>
+        <w:t>• Параметры начитки: 6:30 мин | Музыка FlowMusic 432 Hz, Ре минор</w:t>
       </w:r>
     </w:p>
     <w:p>
@@ -870,7 +860,7 @@
           <w:color w:val="C0392B"/>
           <w:sz w:val="20"/>
         </w:rPr>
-        <w:t>🧠 ТЕРАПЕВТИЧЕСКИЙ ЭФФЕКТ И ПСИХОЛОГИЧЕСКИЕ МИШЕНИ</w:t>
+        <w:t>🧠 ТЕРАПЕВТИЧЕСКИЙ ПАСПОРТ</w:t>
         <w:br/>
       </w:r>
       <w:r>
@@ -878,15 +868,13 @@
           <w:rFonts w:ascii="Calibri" w:hAnsi="Calibri"/>
           <w:sz w:val="19"/>
         </w:rPr>
-        <w:t>• Главная мишень: Преодоление экзистенциального краха самооценки после предательства/разрыва («я не нужен», «жизнь кончена»).</w:t>
+        <w:t>• Психологическая мишень: Восстановление базового права на жизнь и счастье после предательства или краха отношений.</w:t>
         <w:br/>
-        <w:t>• Соматический фокус: Активация центральной энергетической вертикали (золотой стержень), снятие соматического сжатия в сердце и шее.</w:t>
+        <w:t>• Соматический фокус: Активация центрального золотого стержня вдоль позвоночника, расправление плеч.</w:t>
         <w:br/>
-        <w:t>• Терапевтический результат: Глубокое осознание собственной автономной ценности. Способность сделать зрелый выбор — восстанавливать союз на новых условиях или достойно его завершить.</w:t>
+        <w:t>• Терапевтический результат: Возврат в позицию хозяина своей судьбы, способного сделать осознанный выбор будущего.</w:t>
         <w:br/>
-        <w:t>• Параметры начитки: Хронометраж 12:45 мин | Музыка 963 Hz, Соль мажор (FlowMusic)</w:t>
-        <w:br/>
-        <w:t>• Косичка метафор: Переправа на свой берег ➔ Золотой стержень оси ➔ Трон зрелости и выбор себя</w:t>
+        <w:t>• Параметры начитки: 12:45 мин | Музыка FlowMusic 963 Hz, Соль мажор</w:t>
       </w:r>
     </w:p>
     <w:p>

</xml_diff>